<commit_message>
Remove palavra facil da atividade
</commit_message>
<xml_diff>
--- a/sistema/FICHA-PRODUTO-MAIS-TECH/INTRODUCAO_COMUNICACAO_ORAL_ESCRITA/04 - FERRAMENTAS-DIGITAIS/AtividadesFerramentasDigitaisFacil.docx
+++ b/sistema/FICHA-PRODUTO-MAIS-TECH/INTRODUCAO_COMUNICACAO_ORAL_ESCRITA/04 - FERRAMENTAS-DIGITAIS/AtividadesFerramentasDigitaisFacil.docx
@@ -144,7 +144,7 @@
                 <w:color w:val="666666"/>
                 <w:sz w:val="16"/>
               </w:rPr>
-              <w:t xml:space="preserve"> CEPLAS BARRAGEM</w:t>
+              <w:t>CEPLAS BARRAGEM</w:t>
             </w:r>
           </w:p>
         </w:tc>
@@ -186,7 +186,7 @@
                 <w:color w:val="666666"/>
                 <w:sz w:val="16"/>
               </w:rPr>
-              <w:t xml:space="preserve"> de </w:t>
+              <w:t>de</w:t>
             </w:r>
             <w:proofErr w:type="spellStart"/>
             <w:r>
@@ -321,7 +321,7 @@
         <w:rPr>
           <w:sz w:val="21"/>
         </w:rPr>
-        <w:t xml:space="preserve">O </w:t>
+        <w:t>O</w:t>
       </w:r>
       <w:proofErr w:type="spellStart"/>
       <w:r>
@@ -449,7 +449,7 @@
         <w:rPr>
           <w:sz w:val="21"/>
         </w:rPr>
-        <w:t xml:space="preserve">Tempo da </w:t>
+        <w:t>Tempo da</w:t>
       </w:r>
       <w:proofErr w:type="spellStart"/>
       <w:r>
@@ -557,7 +557,7 @@
                 <w:color w:val="FFFFFF"/>
                 <w:sz w:val="16"/>
               </w:rPr>
-              <w:t xml:space="preserve">O </w:t>
+              <w:t>O</w:t>
             </w:r>
             <w:proofErr w:type="spellStart"/>
             <w:r>
@@ -1204,7 +1204,7 @@
               <w:rPr>
                 <w:sz w:val="16"/>
               </w:rPr>
-              <w:t xml:space="preserve">Fazer </w:t>
+              <w:t>Fazer</w:t>
             </w:r>
             <w:proofErr w:type="spellStart"/>
             <w:r>
@@ -1232,7 +1232,7 @@
               <w:rPr>
                 <w:sz w:val="16"/>
               </w:rPr>
-              <w:t xml:space="preserve"> simples.</w:t>
+              <w:t>simples.</w:t>
             </w:r>
           </w:p>
         </w:tc>
@@ -1288,7 +1288,7 @@
           <w:sz w:val="17"/>
           <w:lang w:val="pt-BR"/>
         </w:rPr>
-        <w:t xml:space="preserve">[  ] </w:t>
+        <w:t>[ ]</w:t>
       </w:r>
       <w:r>
         <w:rPr>
@@ -1314,7 +1314,7 @@
           <w:sz w:val="17"/>
           <w:lang w:val="pt-BR"/>
         </w:rPr>
-        <w:t xml:space="preserve">[  ] </w:t>
+        <w:t>[ ]</w:t>
       </w:r>
       <w:r>
         <w:rPr>
@@ -1340,7 +1340,7 @@
           <w:sz w:val="17"/>
           <w:lang w:val="pt-BR"/>
         </w:rPr>
-        <w:t xml:space="preserve">[  ] </w:t>
+        <w:t>[ ]</w:t>
       </w:r>
       <w:r>
         <w:rPr>
@@ -1366,7 +1366,7 @@
           <w:sz w:val="17"/>
           <w:lang w:val="pt-BR"/>
         </w:rPr>
-        <w:t xml:space="preserve">[  ] </w:t>
+        <w:t>[ ]</w:t>
       </w:r>
       <w:r>
         <w:rPr>
@@ -1392,7 +1392,7 @@
           <w:sz w:val="17"/>
           <w:lang w:val="pt-BR"/>
         </w:rPr>
-        <w:t xml:space="preserve">[  ] </w:t>
+        <w:t>[ ]</w:t>
       </w:r>
       <w:r>
         <w:rPr>
@@ -1749,7 +1749,7 @@
               <w:rPr>
                 <w:sz w:val="16"/>
               </w:rPr>
-              <w:t xml:space="preserve">: </w:t>
+              <w:t>:</w:t>
             </w:r>
             <w:proofErr w:type="spellStart"/>
             <w:r>
@@ -1763,7 +1763,7 @@
               <w:rPr>
                 <w:sz w:val="16"/>
               </w:rPr>
-              <w:t xml:space="preserve"> um </w:t>
+              <w:t>um</w:t>
             </w:r>
             <w:proofErr w:type="spellStart"/>
             <w:r>
@@ -1929,7 +1929,7 @@
           <w:sz w:val="17"/>
           <w:lang w:val="pt-BR"/>
         </w:rPr>
-        <w:t xml:space="preserve">[  ] </w:t>
+        <w:t>[ ]</w:t>
       </w:r>
       <w:r>
         <w:rPr>
@@ -1955,7 +1955,7 @@
           <w:sz w:val="17"/>
           <w:lang w:val="pt-BR"/>
         </w:rPr>
-        <w:t xml:space="preserve">[  ] </w:t>
+        <w:t>[ ]</w:t>
       </w:r>
       <w:r>
         <w:rPr>
@@ -1980,7 +1980,7 @@
           <w:sz w:val="17"/>
           <w:lang w:val="pt-BR"/>
         </w:rPr>
-        <w:t xml:space="preserve">Por quê? </w:t>
+        <w:t>Por quê?</w:t>
       </w:r>
       <w:r>
         <w:rPr>
@@ -2025,7 +2025,7 @@
           <w:sz w:val="17"/>
           <w:lang w:val="pt-BR"/>
         </w:rPr>
-        <w:t xml:space="preserve">[  ] </w:t>
+        <w:t>[ ]</w:t>
       </w:r>
       <w:r>
         <w:rPr>
@@ -2051,7 +2051,7 @@
           <w:sz w:val="17"/>
           <w:lang w:val="pt-BR"/>
         </w:rPr>
-        <w:t xml:space="preserve">[  ] </w:t>
+        <w:t>[ ]</w:t>
       </w:r>
       <w:r>
         <w:rPr>
@@ -2076,7 +2076,7 @@
           <w:sz w:val="17"/>
           <w:lang w:val="pt-BR"/>
         </w:rPr>
-        <w:t xml:space="preserve">Por quê? </w:t>
+        <w:t>Por quê?</w:t>
       </w:r>
       <w:r>
         <w:rPr>
@@ -2121,7 +2121,7 @@
           <w:sz w:val="17"/>
           <w:lang w:val="pt-BR"/>
         </w:rPr>
-        <w:t xml:space="preserve">[  ] </w:t>
+        <w:t>[ ]</w:t>
       </w:r>
       <w:r>
         <w:rPr>
@@ -2147,7 +2147,7 @@
           <w:sz w:val="17"/>
           <w:lang w:val="pt-BR"/>
         </w:rPr>
-        <w:t xml:space="preserve">[  ] </w:t>
+        <w:t>[ ]</w:t>
       </w:r>
       <w:r>
         <w:rPr>
@@ -2172,7 +2172,7 @@
           <w:sz w:val="17"/>
           <w:lang w:val="pt-BR"/>
         </w:rPr>
-        <w:t xml:space="preserve">Por quê? </w:t>
+        <w:t>Por quê?</w:t>
       </w:r>
       <w:r>
         <w:rPr>
@@ -2217,7 +2217,7 @@
           <w:sz w:val="17"/>
           <w:lang w:val="pt-BR"/>
         </w:rPr>
-        <w:t xml:space="preserve">[  ] </w:t>
+        <w:t>[ ]</w:t>
       </w:r>
       <w:r>
         <w:rPr>
@@ -2243,7 +2243,7 @@
           <w:sz w:val="17"/>
           <w:lang w:val="pt-BR"/>
         </w:rPr>
-        <w:t xml:space="preserve">[  ] </w:t>
+        <w:t>[ ]</w:t>
       </w:r>
       <w:r>
         <w:rPr>
@@ -2265,7 +2265,7 @@
           <w:sz w:val="17"/>
           <w:lang w:val="pt-BR"/>
         </w:rPr>
-        <w:t xml:space="preserve">Por quê? </w:t>
+        <w:t>Por quê?</w:t>
       </w:r>
       <w:r>
         <w:rPr>
@@ -2286,7 +2286,7 @@
         <w:rPr>
           <w:sz w:val="26"/>
         </w:rPr>
-        <w:t xml:space="preserve">PASSO 4 - Monte </w:t>
+        <w:t>PASSO 4 - Monte</w:t>
       </w:r>
       <w:proofErr w:type="spellStart"/>
       <w:r>
@@ -2505,7 +2505,7 @@
               <w:rPr>
                 <w:sz w:val="16"/>
               </w:rPr>
-              <w:t xml:space="preserve">1. </w:t>
+              <w:t>1.</w:t>
             </w:r>
             <w:proofErr w:type="spellStart"/>
             <w:r>
@@ -2568,7 +2568,7 @@
               <w:rPr>
                 <w:sz w:val="16"/>
               </w:rPr>
-              <w:t xml:space="preserve">2. </w:t>
+              <w:t>2.</w:t>
             </w:r>
             <w:proofErr w:type="spellStart"/>
             <w:r>
@@ -2635,7 +2635,7 @@
               <w:rPr>
                 <w:sz w:val="16"/>
               </w:rPr>
-              <w:t xml:space="preserve">3. </w:t>
+              <w:t>3.</w:t>
             </w:r>
             <w:proofErr w:type="spellStart"/>
             <w:r>
@@ -2702,7 +2702,7 @@
               <w:rPr>
                 <w:sz w:val="16"/>
               </w:rPr>
-              <w:t xml:space="preserve">4. </w:t>
+              <w:t>4.</w:t>
             </w:r>
             <w:proofErr w:type="spellStart"/>
             <w:r>
@@ -2716,7 +2716,7 @@
               <w:rPr>
                 <w:sz w:val="16"/>
               </w:rPr>
-              <w:t xml:space="preserve"> e </w:t>
+              <w:t>e</w:t>
             </w:r>
             <w:proofErr w:type="spellStart"/>
             <w:r>
@@ -2750,7 +2750,7 @@
                 <w:sz w:val="16"/>
                 <w:lang w:val="pt-BR"/>
               </w:rPr>
-              <w:t xml:space="preserve">Preciso dele até as 14h. </w:t>
+              <w:t>Preciso dele até as 14h.</w:t>
             </w:r>
             <w:proofErr w:type="spellStart"/>
             <w:r>
@@ -2820,7 +2820,7 @@
           <w:sz w:val="17"/>
           <w:lang w:val="pt-BR"/>
         </w:rPr>
-        <w:t xml:space="preserve">[  ] </w:t>
+        <w:t>[ ]</w:t>
       </w:r>
       <w:r>
         <w:rPr>
@@ -2846,7 +2846,7 @@
           <w:sz w:val="17"/>
           <w:lang w:val="pt-BR"/>
         </w:rPr>
-        <w:t xml:space="preserve">[  ] </w:t>
+        <w:t>[ ]</w:t>
       </w:r>
       <w:r>
         <w:rPr>
@@ -2888,7 +2888,7 @@
           <w:sz w:val="17"/>
           <w:lang w:val="pt-BR"/>
         </w:rPr>
-        <w:t xml:space="preserve">[  ] </w:t>
+        <w:t>[ ]</w:t>
       </w:r>
       <w:r>
         <w:rPr>
@@ -2914,7 +2914,7 @@
           <w:sz w:val="17"/>
           <w:lang w:val="pt-BR"/>
         </w:rPr>
-        <w:t xml:space="preserve">[  ] </w:t>
+        <w:t>[ ]</w:t>
       </w:r>
       <w:r>
         <w:rPr>
@@ -2956,7 +2956,7 @@
           <w:sz w:val="17"/>
           <w:lang w:val="pt-BR"/>
         </w:rPr>
-        <w:t xml:space="preserve">[  ] </w:t>
+        <w:t>[ ]</w:t>
       </w:r>
       <w:r>
         <w:rPr>
@@ -2982,7 +2982,7 @@
           <w:sz w:val="17"/>
           <w:lang w:val="pt-BR"/>
         </w:rPr>
-        <w:t xml:space="preserve">[  ] </w:t>
+        <w:t>[ ]</w:t>
       </w:r>
       <w:r>
         <w:rPr>
@@ -3024,7 +3024,7 @@
           <w:sz w:val="17"/>
           <w:lang w:val="pt-BR"/>
         </w:rPr>
-        <w:t xml:space="preserve">[  ] </w:t>
+        <w:t>[ ]</w:t>
       </w:r>
       <w:r>
         <w:rPr>
@@ -3050,7 +3050,7 @@
           <w:sz w:val="17"/>
           <w:lang w:val="pt-BR"/>
         </w:rPr>
-        <w:t xml:space="preserve">[  ] </w:t>
+        <w:t>[ ]</w:t>
       </w:r>
       <w:r>
         <w:rPr>
@@ -3184,7 +3184,7 @@
         <w:rPr>
           <w:sz w:val="21"/>
         </w:rPr>
-        <w:t xml:space="preserve">Banco de </w:t>
+        <w:t>Banco de</w:t>
       </w:r>
       <w:proofErr w:type="spellStart"/>
       <w:r>
@@ -3310,7 +3310,7 @@
           <w:sz w:val="17"/>
           <w:lang w:val="pt-BR"/>
         </w:rPr>
-        <w:t xml:space="preserve">[  ] </w:t>
+        <w:t>[ ]</w:t>
       </w:r>
       <w:r>
         <w:rPr>
@@ -3336,7 +3336,7 @@
           <w:sz w:val="17"/>
           <w:lang w:val="pt-BR"/>
         </w:rPr>
-        <w:t xml:space="preserve">[  ] </w:t>
+        <w:t>[ ]</w:t>
       </w:r>
       <w:r>
         <w:rPr>
@@ -3362,7 +3362,7 @@
           <w:sz w:val="17"/>
           <w:lang w:val="pt-BR"/>
         </w:rPr>
-        <w:t xml:space="preserve">[  ] </w:t>
+        <w:t>[ ]</w:t>
       </w:r>
       <w:r>
         <w:rPr>
@@ -3388,7 +3388,7 @@
           <w:sz w:val="17"/>
           <w:lang w:val="pt-BR"/>
         </w:rPr>
-        <w:t xml:space="preserve">[  ] </w:t>
+        <w:t>[ ]</w:t>
       </w:r>
       <w:r>
         <w:rPr>
@@ -3414,7 +3414,7 @@
           <w:sz w:val="17"/>
           <w:lang w:val="pt-BR"/>
         </w:rPr>
-        <w:t xml:space="preserve">[  ] </w:t>
+        <w:t>[ ]</w:t>
       </w:r>
       <w:r>
         <w:rPr>
@@ -3440,7 +3440,7 @@
           <w:sz w:val="17"/>
           <w:lang w:val="pt-BR"/>
         </w:rPr>
-        <w:t xml:space="preserve">[  ] </w:t>
+        <w:t>[ ]</w:t>
       </w:r>
       <w:r>
         <w:rPr>
@@ -3753,14 +3753,14 @@
           <w:sz w:val="17"/>
           <w:lang w:val="pt-BR"/>
         </w:rPr>
-        <w:t xml:space="preserve">[  ] </w:t>
+        <w:t>[ ]</w:t>
       </w:r>
       <w:r>
         <w:rPr>
           <w:sz w:val="17"/>
           <w:lang w:val="pt-BR"/>
         </w:rPr>
-        <w:t>Fácil</w:t>
+        <w:t>Consegui</w:t>
       </w:r>
     </w:p>
     <w:p>
@@ -3779,7 +3779,7 @@
           <w:sz w:val="17"/>
           <w:lang w:val="pt-BR"/>
         </w:rPr>
-        <w:t xml:space="preserve">[  ] </w:t>
+        <w:t>[ ]</w:t>
       </w:r>
       <w:r>
         <w:rPr>
@@ -3805,7 +3805,7 @@
           <w:sz w:val="17"/>
           <w:lang w:val="pt-BR"/>
         </w:rPr>
-        <w:t xml:space="preserve">[  ] </w:t>
+        <w:t>[ ]</w:t>
       </w:r>
       <w:r>
         <w:rPr>
@@ -3847,14 +3847,14 @@
           <w:sz w:val="17"/>
           <w:lang w:val="pt-BR"/>
         </w:rPr>
-        <w:t xml:space="preserve">[  ] </w:t>
+        <w:t>[ ]</w:t>
       </w:r>
       <w:r>
         <w:rPr>
           <w:sz w:val="17"/>
           <w:lang w:val="pt-BR"/>
         </w:rPr>
-        <w:t>Fácil</w:t>
+        <w:t>Consegui</w:t>
       </w:r>
     </w:p>
     <w:p>
@@ -3873,7 +3873,7 @@
           <w:sz w:val="17"/>
           <w:lang w:val="pt-BR"/>
         </w:rPr>
-        <w:t xml:space="preserve">[  ] </w:t>
+        <w:t>[ ]</w:t>
       </w:r>
       <w:r>
         <w:rPr>
@@ -3899,7 +3899,7 @@
           <w:sz w:val="17"/>
           <w:lang w:val="pt-BR"/>
         </w:rPr>
-        <w:t xml:space="preserve">[  ] </w:t>
+        <w:t>[ ]</w:t>
       </w:r>
       <w:r>
         <w:rPr>
@@ -3941,7 +3941,7 @@
           <w:sz w:val="17"/>
           <w:lang w:val="pt-BR"/>
         </w:rPr>
-        <w:t xml:space="preserve">[  ] </w:t>
+        <w:t>[ ]</w:t>
       </w:r>
       <w:r>
         <w:rPr>
@@ -3967,7 +3967,7 @@
           <w:sz w:val="17"/>
           <w:lang w:val="pt-BR"/>
         </w:rPr>
-        <w:t xml:space="preserve">[  ] </w:t>
+        <w:t>[ ]</w:t>
       </w:r>
       <w:r>
         <w:rPr>
@@ -3993,7 +3993,7 @@
           <w:sz w:val="17"/>
           <w:lang w:val="pt-BR"/>
         </w:rPr>
-        <w:t xml:space="preserve">[  ] </w:t>
+        <w:t>[ ]</w:t>
       </w:r>
       <w:r>
         <w:rPr>
@@ -4022,7 +4022,7 @@
         <w:rPr>
           <w:sz w:val="26"/>
         </w:rPr>
-        <w:t xml:space="preserve"> do professor</w:t>
+        <w:t>do professor</w:t>
       </w:r>
     </w:p>
     <w:tbl>
@@ -4185,7 +4185,7 @@
                 <w:sz w:val="16"/>
                 <w:lang w:val="pt-BR"/>
               </w:rPr>
-              <w:t xml:space="preserve">[  ] Sim   [  </w:t>
+              <w:t>[ ] Sim [</w:t>
             </w:r>
             <w:proofErr w:type="gramStart"/>
             <w:r>
@@ -4201,7 +4201,7 @@
                 <w:sz w:val="16"/>
                 <w:lang w:val="pt-BR"/>
               </w:rPr>
-              <w:t xml:space="preserve"> apoio   [  ] Ainda não</w:t>
+              <w:t>apoio [ ] Ainda não</w:t>
             </w:r>
           </w:p>
         </w:tc>
@@ -4239,7 +4239,7 @@
               <w:rPr>
                 <w:sz w:val="16"/>
               </w:rPr>
-              <w:t xml:space="preserve"> as </w:t>
+              <w:t>as</w:t>
             </w:r>
             <w:proofErr w:type="spellStart"/>
             <w:r>
@@ -4253,7 +4253,7 @@
               <w:rPr>
                 <w:sz w:val="16"/>
               </w:rPr>
-              <w:t xml:space="preserve"> partes</w:t>
+              <w:t>partes</w:t>
             </w:r>
           </w:p>
         </w:tc>
@@ -4282,7 +4282,7 @@
                 <w:sz w:val="16"/>
                 <w:lang w:val="pt-BR"/>
               </w:rPr>
-              <w:t xml:space="preserve">[  ] Sim   [  </w:t>
+              <w:t>[ ] Sim [</w:t>
             </w:r>
             <w:proofErr w:type="gramStart"/>
             <w:r>
@@ -4298,7 +4298,7 @@
                 <w:sz w:val="16"/>
                 <w:lang w:val="pt-BR"/>
               </w:rPr>
-              <w:t xml:space="preserve"> apoio   [  ] Ainda não</w:t>
+              <w:t>apoio [ ] Ainda não</w:t>
             </w:r>
           </w:p>
         </w:tc>
@@ -4387,7 +4387,7 @@
                 <w:sz w:val="16"/>
                 <w:lang w:val="pt-BR"/>
               </w:rPr>
-              <w:t xml:space="preserve">[  ] Sim   [  </w:t>
+              <w:t>[ ] Sim [</w:t>
             </w:r>
             <w:proofErr w:type="gramStart"/>
             <w:r>
@@ -4403,7 +4403,7 @@
                 <w:sz w:val="16"/>
                 <w:lang w:val="pt-BR"/>
               </w:rPr>
-              <w:t xml:space="preserve"> apoio   [  ] Ainda não</w:t>
+              <w:t>apoio [ ] Ainda não</w:t>
             </w:r>
           </w:p>
         </w:tc>
@@ -4441,7 +4441,7 @@
               <w:rPr>
                 <w:sz w:val="16"/>
               </w:rPr>
-              <w:t xml:space="preserve"> antes de </w:t>
+              <w:t>antes de</w:t>
             </w:r>
             <w:proofErr w:type="spellStart"/>
             <w:r>
@@ -4478,7 +4478,7 @@
                 <w:sz w:val="16"/>
                 <w:lang w:val="pt-BR"/>
               </w:rPr>
-              <w:t xml:space="preserve">[  ] Sim   [  </w:t>
+              <w:t>[ ] Sim [</w:t>
             </w:r>
             <w:proofErr w:type="gramStart"/>
             <w:r>
@@ -4494,7 +4494,7 @@
                 <w:sz w:val="16"/>
                 <w:lang w:val="pt-BR"/>
               </w:rPr>
-              <w:t xml:space="preserve"> apoio   [  ] Ainda não</w:t>
+              <w:t>apoio [ ] Ainda não</w:t>
             </w:r>
           </w:p>
         </w:tc>
@@ -4620,33 +4620,30 @@
         <w:sz w:val="14"/>
         <w:lang w:val="pt-BR"/>
       </w:rPr>
-      <w:t xml:space="preserve">Rio do Sul Mais Tech  |  </w:t>
+      <w:t>Rio do Sul Mais Tech |</w:t>
     </w:r>
     <w:r>
       <w:rPr>
         <w:sz w:val="14"/>
         <w:lang w:val="pt-BR"/>
       </w:rPr>
-      <w:t xml:space="preserve">Página </w:t>
+      <w:t>Página</w:t>
     </w:r>
     <w:r>
       <w:rPr>
         <w:sz w:val="14"/>
       </w:rPr>
-      <w:fldChar w:fldCharType="begin"/>
     </w:r>
     <w:r>
       <w:rPr>
         <w:sz w:val="14"/>
         <w:lang w:val="pt-BR"/>
       </w:rPr>
-      <w:instrText>PAGE</w:instrText>
     </w:r>
     <w:r>
       <w:rPr>
         <w:sz w:val="14"/>
       </w:rPr>
-      <w:fldChar w:fldCharType="separate"/>
     </w:r>
     <w:r>
       <w:rPr>
@@ -4660,7 +4657,6 @@
       <w:rPr>
         <w:sz w:val="14"/>
       </w:rPr>
-      <w:fldChar w:fldCharType="end"/>
     </w:r>
   </w:p>
 </w:ftr>
@@ -4705,7 +4701,7 @@
         <w:color w:val="666666"/>
         <w:sz w:val="14"/>
       </w:rPr>
-      <w:t xml:space="preserve">SENAI | </w:t>
+      <w:t>SENAI |</w:t>
     </w:r>
     <w:proofErr w:type="spellStart"/>
     <w:r>
@@ -4732,7 +4728,6 @@
         <w:color w:val="666666"/>
         <w:sz w:val="14"/>
       </w:rPr>
-      <w:t>fácil</w:t>
     </w:r>
     <w:proofErr w:type="spellEnd"/>
     <w:r>
@@ -4741,7 +4736,7 @@
         <w:color w:val="666666"/>
         <w:sz w:val="14"/>
       </w:rPr>
-      <w:t xml:space="preserve"> - Ferramentas </w:t>
+      <w:t>- Ferramentas</w:t>
     </w:r>
     <w:proofErr w:type="spellStart"/>
     <w:r>

</xml_diff>